<commit_message>
Update resume wording and add portfolio link
Rephrase BrM bullets as experience statements, clean up dash-heavy
sentences, and add skyliner33v.github.io to the contact links.

Co-Authored-By: Claude Fable 5 <noreply@anthropic.com>
</commit_message>
<xml_diff>
--- a/Jason_Parent_Resume.docx
+++ b/Jason_Parent_Resume.docx
@@ -77,6 +77,25 @@
           <w:t>nwopsbridge.com</w:t>
         </w:r>
       </w:hyperlink>
+      <w:r>
+        <w:rPr>
+          <w:color w:val="555555"/>
+          <w:sz w:val="20"/>
+          <w:szCs w:val="20"/>
+        </w:rPr>
+        <w:t xml:space="preserve">  |  </w:t>
+      </w:r>
+      <w:hyperlink r:id="rId11" w:history="1">
+        <w:r>
+          <w:rPr>
+            <w:color w:val="1B365D"/>
+            <w:sz w:val="20"/>
+            <w:szCs w:val="20"/>
+            <w:u w:val="single"/>
+          </w:rPr>
+          <w:t>skyliner33v.github.io</w:t>
+        </w:r>
+      </w:hyperlink>
     </w:p>
     <w:p>
       <w:pPr>
@@ -105,7 +124,7 @@
         <w:rPr>
           <w:color w:val="333333"/>
         </w:rPr>
-        <w:t>Full-stack .NET developer with 20 years of bridge infrastructure experience at Washington State DOT. Daily AASHTOWare BrM user building modern Blazor applications with AI integration for bridge data analysis. Unique combination of field inspection expertise, database development, and explainable AI — I know what bridge engineers need from their tools because I’ve been one. Self-directed builder with entrepreneurial drive, currently leading legacy-to-modern migration of bridge data systems serving engineers statewide.</w:t>
+        <w:t>Full-stack .NET developer with 20 years of bridge infrastructure experience at Washington State DOT. Extensive hands-on AASHTOWare BrM experience. Builds modern Blazor applications with AI integration for bridge data analysis. Unique combination of field inspection expertise, database development, and explainable AI. I know what bridge engineers need from their tools because I’ve been one. Self-directed builder with entrepreneurial drive, currently leading legacy-to-modern migration of bridge data systems serving engineers statewide.</w:t>
       </w:r>
     </w:p>
     <w:p>
@@ -257,13 +276,7 @@
         <w:rPr>
           <w:color w:val="333333"/>
         </w:rPr>
-        <w:t>Claude Code, GitHub Copilot</w:t>
-      </w:r>
-      <w:r>
-        <w:rPr>
-          <w:color w:val="333333"/>
-        </w:rPr>
-        <w:t>, OpenAI Codex, Cursor</w:t>
+        <w:t>Claude Code, GitHub Copilot, OpenAI Codex, Cursor</w:t>
       </w:r>
     </w:p>
     <w:p>
@@ -344,31 +357,7 @@
         <w:rPr>
           <w:color w:val="333333"/>
         </w:rPr>
-        <w:t xml:space="preserve">Primary developer and database specialist for WSDOT’s bridge data systems, managing data for </w:t>
-      </w:r>
-      <w:r>
-        <w:rPr>
-          <w:color w:val="333333"/>
-        </w:rPr>
-        <w:t>10</w:t>
-      </w:r>
-      <w:r>
-        <w:rPr>
-          <w:color w:val="333333"/>
-        </w:rPr>
-        <w:t>,</w:t>
-      </w:r>
-      <w:r>
-        <w:rPr>
-          <w:color w:val="333333"/>
-        </w:rPr>
-        <w:t>800</w:t>
-      </w:r>
-      <w:r>
-        <w:rPr>
-          <w:color w:val="333333"/>
-        </w:rPr>
-        <w:t>+ structures and serving engineers and inspectors statewide</w:t>
+        <w:t xml:space="preserve">Primary developer and database specialist for WSDOT’s bridge data systems, managing data for 10,800+ structures and serving engineers and inspectors statewide</w:t>
       </w:r>
     </w:p>
     <w:p>
@@ -400,23 +389,23 @@
         <w:rPr>
           <w:color w:val="333333"/>
         </w:rPr>
-        <w:t>Daily user of AASHTOWare BrM for bridge inventory management and inspection data workflows</w:t>
-      </w:r>
-    </w:p>
-    <w:p>
-      <w:pPr>
-        <w:pStyle w:val="ListParagraph"/>
-        <w:numPr>
-          <w:ilvl w:val="0"/>
-          <w:numId w:val="2"/>
-        </w:numPr>
-        <w:spacing w:before="30" w:after="30"/>
-      </w:pPr>
-      <w:r>
-        <w:rPr>
-          <w:color w:val="333333"/>
-        </w:rPr>
-        <w:t>Developed and maintained SSIS ETL pipelines feeding AASHTOWare BrM; built complete new ETL suite for BrM 7 release — reverse-engineered source database to ensure correct referential integrity across multiple tables</w:t>
+        <w:t>Deep AASHTOWare BrM expertise from years of daily use across bridge inventory management and inspection data workflows</w:t>
+      </w:r>
+    </w:p>
+    <w:p>
+      <w:pPr>
+        <w:pStyle w:val="ListParagraph"/>
+        <w:numPr>
+          <w:ilvl w:val="0"/>
+          <w:numId w:val="2"/>
+        </w:numPr>
+        <w:spacing w:before="30" w:after="30"/>
+      </w:pPr>
+      <w:r>
+        <w:rPr>
+          <w:color w:val="333333"/>
+        </w:rPr>
+        <w:t>Developed and maintained SSIS ETL pipelines feeding AASHTOWare BrM; built complete new ETL suite for BrM 7 release; reverse-engineered the source database to ensure correct referential integrity across multiple tables</w:t>
       </w:r>
     </w:p>
     <w:p>
@@ -448,7 +437,7 @@
         <w:rPr>
           <w:color w:val="333333"/>
         </w:rPr>
-        <w:t>Built and manage complete DevOps environment — sprint planning, epic/issue creation, delivery plans, CI/CD pipelines, and commits tied to work items</w:t>
+        <w:t>Built and manage complete DevOps environment: sprint planning, epic/issue creation, delivery plans, CI/CD pipelines, and commits tied to work items</w:t>
       </w:r>
     </w:p>
     <w:p>
@@ -480,19 +469,7 @@
         <w:rPr>
           <w:color w:val="333333"/>
         </w:rPr>
-        <w:t xml:space="preserve">Remediated broken database </w:t>
-      </w:r>
-      <w:r>
-        <w:rPr>
-          <w:color w:val="333333"/>
-        </w:rPr>
-        <w:t>objects</w:t>
-      </w:r>
-      <w:r>
-        <w:rPr>
-          <w:color w:val="333333"/>
-        </w:rPr>
-        <w:t xml:space="preserve"> and built comprehensive documentation where none existed</w:t>
+        <w:t xml:space="preserve">Remediated broken database objects and built comprehensive documentation where none existed</w:t>
       </w:r>
     </w:p>
     <w:p>
@@ -602,7 +579,7 @@
         <w:rPr>
           <w:color w:val="333333"/>
         </w:rPr>
-        <w:t>Promoted directly from BE2 to BE4, skipping BE3 entirely — recognized for technical aptitude</w:t>
+        <w:t>Promoted directly from BE2 to BE4, skipping BE3 entirely, in recognition of technical aptitude</w:t>
       </w:r>
     </w:p>
     <w:p>
@@ -729,7 +706,7 @@
         <w:rPr>
           <w:color w:val="333333"/>
         </w:rPr>
-        <w:t>Built strong relationships with project superintendents and foremen — two offered employment</w:t>
+        <w:t>Built strong relationships with project superintendents and foremen; two offered employment</w:t>
       </w:r>
     </w:p>
     <w:p>
@@ -775,19 +752,7 @@
         <w:rPr>
           <w:color w:val="555555"/>
         </w:rPr>
-        <w:t xml:space="preserve">  |  </w:t>
-      </w:r>
-      <w:r>
-        <w:rPr>
-          <w:color w:val="555555"/>
-        </w:rPr>
-        <w:t>Chehalis</w:t>
-      </w:r>
-      <w:r>
-        <w:rPr>
-          <w:color w:val="555555"/>
-        </w:rPr>
-        <w:t>, WA</w:t>
+        <w:t xml:space="preserve">  |  Chehalis, WA</w:t>
       </w:r>
     </w:p>
     <w:p>
@@ -913,7 +878,7 @@
         <w:rPr>
           <w:color w:val="333333"/>
         </w:rPr>
-        <w:t>Developed LeadProspector — a Python CLI/web app data pipeline that scrapes WA State L&amp;I contractor database, scores websites on a 0–100 quality scale, and outputs prioritized lead lists</w:t>
+        <w:t>Developed LeadProspector, a Python CLI/web app data pipeline that scrapes WA State L&amp;I contractor database, scores websites on a 0–100 quality scale, and outputs prioritized lead lists</w:t>
       </w:r>
     </w:p>
     <w:p>
@@ -1020,7 +985,7 @@
         <w:rPr>
           <w:color w:val="333333"/>
         </w:rPr>
-        <w:t>AI analysis via Claude API with FHWA reference data as RAG context — every claim traces to specific NBI fields and federal standards</w:t>
+        <w:t>AI analysis via Claude API with FHWA reference data as RAG context; every claim traces to specific NBI fields and federal standards</w:t>
       </w:r>
     </w:p>
     <w:p>
@@ -1087,55 +1052,55 @@
         <w:rPr>
           <w:color w:val="333333"/>
         </w:rPr>
-        <w:t>Bridge Inspector Certification — WSDOT Bridge Condition Inspection Training (BCIT) - 2016</w:t>
-      </w:r>
-    </w:p>
-    <w:p>
-      <w:pPr>
-        <w:pStyle w:val="ListParagraph"/>
-        <w:numPr>
-          <w:ilvl w:val="0"/>
-          <w:numId w:val="2"/>
-        </w:numPr>
-        <w:spacing w:before="30" w:after="30"/>
-      </w:pPr>
-      <w:r>
-        <w:rPr>
-          <w:color w:val="333333"/>
-        </w:rPr>
-        <w:t>UBIT (Under Bridge Inspection Truck) Operations — 2016</w:t>
-      </w:r>
-    </w:p>
-    <w:p>
-      <w:pPr>
-        <w:pStyle w:val="ListParagraph"/>
-        <w:numPr>
-          <w:ilvl w:val="0"/>
-          <w:numId w:val="2"/>
-        </w:numPr>
-        <w:spacing w:before="30" w:after="30"/>
-      </w:pPr>
-      <w:r>
-        <w:rPr>
-          <w:color w:val="333333"/>
-        </w:rPr>
-        <w:t>Engineering Technician Journeyman — WSDOT Apprenticeship Program, 2006-2008</w:t>
-      </w:r>
-    </w:p>
-    <w:p>
-      <w:pPr>
-        <w:pStyle w:val="ListParagraph"/>
-        <w:numPr>
-          <w:ilvl w:val="0"/>
-          <w:numId w:val="2"/>
-        </w:numPr>
-        <w:spacing w:before="30" w:after="30"/>
-      </w:pPr>
-      <w:r>
-        <w:rPr>
-          <w:color w:val="333333"/>
-        </w:rPr>
-        <w:t>BlissRoms / Android AOSP — Custom ROM development, remote Linux build coordination (2014–2016)</w:t>
+        <w:t>Bridge Inspector Certification - WSDOT Bridge Condition Inspection Training (BCIT) - 2016</w:t>
+      </w:r>
+    </w:p>
+    <w:p>
+      <w:pPr>
+        <w:pStyle w:val="ListParagraph"/>
+        <w:numPr>
+          <w:ilvl w:val="0"/>
+          <w:numId w:val="2"/>
+        </w:numPr>
+        <w:spacing w:before="30" w:after="30"/>
+      </w:pPr>
+      <w:r>
+        <w:rPr>
+          <w:color w:val="333333"/>
+        </w:rPr>
+        <w:t>UBIT (Under Bridge Inspection Truck) Operations - 2016</w:t>
+      </w:r>
+    </w:p>
+    <w:p>
+      <w:pPr>
+        <w:pStyle w:val="ListParagraph"/>
+        <w:numPr>
+          <w:ilvl w:val="0"/>
+          <w:numId w:val="2"/>
+        </w:numPr>
+        <w:spacing w:before="30" w:after="30"/>
+      </w:pPr>
+      <w:r>
+        <w:rPr>
+          <w:color w:val="333333"/>
+        </w:rPr>
+        <w:t>Engineering Technician Journeyman - WSDOT Apprenticeship Program, 2006-2008</w:t>
+      </w:r>
+    </w:p>
+    <w:p>
+      <w:pPr>
+        <w:pStyle w:val="ListParagraph"/>
+        <w:numPr>
+          <w:ilvl w:val="0"/>
+          <w:numId w:val="2"/>
+        </w:numPr>
+        <w:spacing w:before="30" w:after="30"/>
+      </w:pPr>
+      <w:r>
+        <w:rPr>
+          <w:color w:val="333333"/>
+        </w:rPr>
+        <w:t>BlissRoms / Android AOSP - Custom ROM development, remote Linux build coordination (2014–2016)</w:t>
       </w:r>
     </w:p>
     <w:sectPr>

</xml_diff>